<commit_message>
addng teck stack documentation do requirements document, creating time estimation document to be discussed
</commit_message>
<xml_diff>
--- a/Requirements.docx
+++ b/Requirements.docx
@@ -11,6 +11,17 @@
     </w:p>
     <w:sdt>
       <w:sdtPr>
+        <w:rPr>
+          <w:rFonts w:asciiTheme="minorHAnsi" w:eastAsiaTheme="minorHAnsi" w:hAnsiTheme="minorHAnsi" w:cstheme="minorBidi"/>
+          <w:b w:val="0"/>
+          <w:bCs w:val="0"/>
+          <w:color w:val="auto"/>
+          <w:kern w:val="2"/>
+          <w:sz w:val="24"/>
+          <w:szCs w:val="24"/>
+          <w:lang w:val="en-MX"/>
+          <w14:ligatures w14:val="standardContextual"/>
+        </w:rPr>
         <w:id w:val="951046413"/>
         <w:docPartObj>
           <w:docPartGallery w:val="Table of Contents"/>
@@ -19,14 +30,7 @@
       </w:sdtPr>
       <w:sdtEndPr>
         <w:rPr>
-          <w:rFonts w:asciiTheme="minorHAnsi" w:eastAsiaTheme="minorHAnsi" w:hAnsiTheme="minorHAnsi" w:cstheme="minorBidi"/>
           <w:noProof/>
-          <w:color w:val="auto"/>
-          <w:kern w:val="2"/>
-          <w:sz w:val="24"/>
-          <w:szCs w:val="24"/>
-          <w:lang w:val="en-MX"/>
-          <w14:ligatures w14:val="standardContextual"/>
         </w:rPr>
       </w:sdtEndPr>
       <w:sdtContent>
@@ -70,7 +74,7 @@
             </w:rPr>
             <w:fldChar w:fldCharType="separate"/>
           </w:r>
-          <w:hyperlink w:anchor="_Toc190255135" w:history="1">
+          <w:hyperlink w:anchor="_Toc190256825" w:history="1">
             <w:r>
               <w:rPr>
                 <w:rStyle w:val="Hyperlink"/>
@@ -98,7 +102,7 @@
                 <w:noProof/>
                 <w:webHidden/>
               </w:rPr>
-              <w:instrText xml:space="preserve"> PAGEREF _Toc190255135 \h </w:instrText>
+              <w:instrText xml:space="preserve"> PAGEREF _Toc190256825 \h </w:instrText>
             </w:r>
             <w:r>
               <w:rPr>
@@ -144,7 +148,7 @@
               <w:szCs w:val="24"/>
             </w:rPr>
           </w:pPr>
-          <w:hyperlink w:anchor="_Toc190255136" w:history="1">
+          <w:hyperlink w:anchor="_Toc190256826" w:history="1">
             <w:r>
               <w:rPr>
                 <w:rStyle w:val="Hyperlink"/>
@@ -172,7 +176,7 @@
                 <w:noProof/>
                 <w:webHidden/>
               </w:rPr>
-              <w:instrText xml:space="preserve"> PAGEREF _Toc190255136 \h </w:instrText>
+              <w:instrText xml:space="preserve"> PAGEREF _Toc190256826 \h </w:instrText>
             </w:r>
             <w:r>
               <w:rPr>
@@ -218,7 +222,7 @@
               <w:szCs w:val="24"/>
             </w:rPr>
           </w:pPr>
-          <w:hyperlink w:anchor="_Toc190255137" w:history="1">
+          <w:hyperlink w:anchor="_Toc190256827" w:history="1">
             <w:r>
               <w:rPr>
                 <w:rStyle w:val="Hyperlink"/>
@@ -245,7 +249,7 @@
                 <w:noProof/>
                 <w:webHidden/>
               </w:rPr>
-              <w:instrText xml:space="preserve"> PAGEREF _Toc190255137 \h </w:instrText>
+              <w:instrText xml:space="preserve"> PAGEREF _Toc190256827 \h </w:instrText>
             </w:r>
             <w:r>
               <w:rPr>
@@ -291,7 +295,7 @@
               <w:szCs w:val="24"/>
             </w:rPr>
           </w:pPr>
-          <w:hyperlink w:anchor="_Toc190255138" w:history="1">
+          <w:hyperlink w:anchor="_Toc190256828" w:history="1">
             <w:r>
               <w:rPr>
                 <w:rStyle w:val="Hyperlink"/>
@@ -318,7 +322,7 @@
                 <w:noProof/>
                 <w:webHidden/>
               </w:rPr>
-              <w:instrText xml:space="preserve"> PAGEREF _Toc190255138 \h </w:instrText>
+              <w:instrText xml:space="preserve"> PAGEREF _Toc190256828 \h </w:instrText>
             </w:r>
             <w:r>
               <w:rPr>
@@ -362,7 +366,7 @@
               <w:szCs w:val="24"/>
             </w:rPr>
           </w:pPr>
-          <w:hyperlink w:anchor="_Toc190255139" w:history="1">
+          <w:hyperlink w:anchor="_Toc190256829" w:history="1">
             <w:r>
               <w:rPr>
                 <w:rStyle w:val="Hyperlink"/>
@@ -390,7 +394,7 @@
                 <w:noProof/>
                 <w:webHidden/>
               </w:rPr>
-              <w:instrText xml:space="preserve"> PAGEREF _Toc190255139 \h </w:instrText>
+              <w:instrText xml:space="preserve"> PAGEREF _Toc190256829 \h </w:instrText>
             </w:r>
             <w:r>
               <w:rPr>
@@ -434,7 +438,7 @@
               <w:szCs w:val="24"/>
             </w:rPr>
           </w:pPr>
-          <w:hyperlink w:anchor="_Toc190255140" w:history="1">
+          <w:hyperlink w:anchor="_Toc190256830" w:history="1">
             <w:r>
               <w:rPr>
                 <w:rStyle w:val="Hyperlink"/>
@@ -461,7 +465,7 @@
                 <w:noProof/>
                 <w:webHidden/>
               </w:rPr>
-              <w:instrText xml:space="preserve"> PAGEREF _Toc190255140 \h </w:instrText>
+              <w:instrText xml:space="preserve"> PAGEREF _Toc190256830 \h </w:instrText>
             </w:r>
             <w:r>
               <w:rPr>
@@ -505,7 +509,7 @@
               <w:szCs w:val="24"/>
             </w:rPr>
           </w:pPr>
-          <w:hyperlink w:anchor="_Toc190255141" w:history="1">
+          <w:hyperlink w:anchor="_Toc190256831" w:history="1">
             <w:r>
               <w:rPr>
                 <w:rStyle w:val="Hyperlink"/>
@@ -533,7 +537,7 @@
                 <w:noProof/>
                 <w:webHidden/>
               </w:rPr>
-              <w:instrText xml:space="preserve"> PAGEREF _Toc190255141 \h </w:instrText>
+              <w:instrText xml:space="preserve"> PAGEREF _Toc190256831 \h </w:instrText>
             </w:r>
             <w:r>
               <w:rPr>
@@ -577,7 +581,7 @@
               <w:szCs w:val="24"/>
             </w:rPr>
           </w:pPr>
-          <w:hyperlink w:anchor="_Toc190255142" w:history="1">
+          <w:hyperlink w:anchor="_Toc190256832" w:history="1">
             <w:r>
               <w:rPr>
                 <w:rStyle w:val="Hyperlink"/>
@@ -604,7 +608,7 @@
                 <w:noProof/>
                 <w:webHidden/>
               </w:rPr>
-              <w:instrText xml:space="preserve"> PAGEREF _Toc190255142 \h </w:instrText>
+              <w:instrText xml:space="preserve"> PAGEREF _Toc190256832 \h </w:instrText>
             </w:r>
             <w:r>
               <w:rPr>
@@ -648,7 +652,7 @@
               <w:szCs w:val="24"/>
             </w:rPr>
           </w:pPr>
-          <w:hyperlink w:anchor="_Toc190255143" w:history="1">
+          <w:hyperlink w:anchor="_Toc190256833" w:history="1">
             <w:r>
               <w:rPr>
                 <w:rStyle w:val="Hyperlink"/>
@@ -676,7 +680,7 @@
                 <w:noProof/>
                 <w:webHidden/>
               </w:rPr>
-              <w:instrText xml:space="preserve"> PAGEREF _Toc190255143 \h </w:instrText>
+              <w:instrText xml:space="preserve"> PAGEREF _Toc190256833 \h </w:instrText>
             </w:r>
             <w:r>
               <w:rPr>
@@ -720,7 +724,7 @@
               <w:szCs w:val="24"/>
             </w:rPr>
           </w:pPr>
-          <w:hyperlink w:anchor="_Toc190255144" w:history="1">
+          <w:hyperlink w:anchor="_Toc190256834" w:history="1">
             <w:r>
               <w:rPr>
                 <w:rStyle w:val="Hyperlink"/>
@@ -747,7 +751,7 @@
                 <w:noProof/>
                 <w:webHidden/>
               </w:rPr>
-              <w:instrText xml:space="preserve"> PAGEREF _Toc190255144 \h </w:instrText>
+              <w:instrText xml:space="preserve"> PAGEREF _Toc190256834 \h </w:instrText>
             </w:r>
             <w:r>
               <w:rPr>
@@ -768,6 +772,154 @@
                 <w:webHidden/>
               </w:rPr>
               <w:t>4</w:t>
+            </w:r>
+            <w:r>
+              <w:rPr>
+                <w:noProof/>
+                <w:webHidden/>
+              </w:rPr>
+              <w:fldChar w:fldCharType="end"/>
+            </w:r>
+          </w:hyperlink>
+        </w:p>
+        <w:p>
+          <w:pPr>
+            <w:pStyle w:val="TOC1"/>
+            <w:tabs>
+              <w:tab w:val="right" w:leader="dot" w:pos="9350"/>
+            </w:tabs>
+            <w:rPr>
+              <w:rFonts w:eastAsiaTheme="minorEastAsia"/>
+              <w:b w:val="0"/>
+              <w:bCs w:val="0"/>
+              <w:i w:val="0"/>
+              <w:iCs w:val="0"/>
+              <w:noProof/>
+            </w:rPr>
+          </w:pPr>
+          <w:hyperlink w:anchor="_Toc190256835" w:history="1">
+            <w:r>
+              <w:rPr>
+                <w:rStyle w:val="Hyperlink"/>
+                <w:noProof/>
+                <w:lang w:val="en-US"/>
+              </w:rPr>
+              <w:t>Technical Stack</w:t>
+            </w:r>
+            <w:r>
+              <w:rPr>
+                <w:noProof/>
+                <w:webHidden/>
+              </w:rPr>
+              <w:tab/>
+            </w:r>
+            <w:r>
+              <w:rPr>
+                <w:noProof/>
+                <w:webHidden/>
+              </w:rPr>
+              <w:fldChar w:fldCharType="begin"/>
+            </w:r>
+            <w:r>
+              <w:rPr>
+                <w:noProof/>
+                <w:webHidden/>
+              </w:rPr>
+              <w:instrText xml:space="preserve"> PAGEREF _Toc190256835 \h </w:instrText>
+            </w:r>
+            <w:r>
+              <w:rPr>
+                <w:noProof/>
+                <w:webHidden/>
+              </w:rPr>
+            </w:r>
+            <w:r>
+              <w:rPr>
+                <w:noProof/>
+                <w:webHidden/>
+              </w:rPr>
+              <w:fldChar w:fldCharType="separate"/>
+            </w:r>
+            <w:r>
+              <w:rPr>
+                <w:noProof/>
+                <w:webHidden/>
+              </w:rPr>
+              <w:t>5</w:t>
+            </w:r>
+            <w:r>
+              <w:rPr>
+                <w:noProof/>
+                <w:webHidden/>
+              </w:rPr>
+              <w:fldChar w:fldCharType="end"/>
+            </w:r>
+          </w:hyperlink>
+        </w:p>
+        <w:p>
+          <w:pPr>
+            <w:pStyle w:val="TOC1"/>
+            <w:tabs>
+              <w:tab w:val="right" w:leader="dot" w:pos="9350"/>
+            </w:tabs>
+            <w:rPr>
+              <w:rFonts w:eastAsiaTheme="minorEastAsia"/>
+              <w:b w:val="0"/>
+              <w:bCs w:val="0"/>
+              <w:i w:val="0"/>
+              <w:iCs w:val="0"/>
+              <w:noProof/>
+            </w:rPr>
+          </w:pPr>
+          <w:hyperlink w:anchor="_Toc190256836" w:history="1">
+            <w:r>
+              <w:rPr>
+                <w:rStyle w:val="Hyperlink"/>
+                <w:noProof/>
+                <w:lang w:val="en-US"/>
+              </w:rPr>
+              <w:t>Data Model</w:t>
+            </w:r>
+            <w:r>
+              <w:rPr>
+                <w:noProof/>
+                <w:webHidden/>
+              </w:rPr>
+              <w:tab/>
+            </w:r>
+            <w:r>
+              <w:rPr>
+                <w:noProof/>
+                <w:webHidden/>
+              </w:rPr>
+              <w:fldChar w:fldCharType="begin"/>
+            </w:r>
+            <w:r>
+              <w:rPr>
+                <w:noProof/>
+                <w:webHidden/>
+              </w:rPr>
+              <w:instrText xml:space="preserve"> PAGEREF _Toc190256836 \h </w:instrText>
+            </w:r>
+            <w:r>
+              <w:rPr>
+                <w:noProof/>
+                <w:webHidden/>
+              </w:rPr>
+            </w:r>
+            <w:r>
+              <w:rPr>
+                <w:noProof/>
+                <w:webHidden/>
+              </w:rPr>
+              <w:fldChar w:fldCharType="separate"/>
+            </w:r>
+            <w:r>
+              <w:rPr>
+                <w:noProof/>
+                <w:webHidden/>
+              </w:rPr>
+              <w:t>5</w:t>
             </w:r>
             <w:r>
               <w:rPr>
@@ -885,7 +1037,7 @@
           <w:lang w:val="en-US"/>
         </w:rPr>
       </w:pPr>
-      <w:bookmarkStart w:id="0" w:name="_Toc190255135"/>
+      <w:bookmarkStart w:id="0" w:name="_Toc190256825"/>
       <w:r>
         <w:rPr>
           <w:lang w:val="en-US"/>
@@ -901,7 +1053,7 @@
           <w:lang w:val="en-US"/>
         </w:rPr>
       </w:pPr>
-      <w:bookmarkStart w:id="1" w:name="_Toc190255136"/>
+      <w:bookmarkStart w:id="1" w:name="_Toc190256826"/>
       <w:r>
         <w:rPr>
           <w:lang w:val="en-US"/>
@@ -951,13 +1103,7 @@
         </w:numPr>
       </w:pPr>
       <w:r>
-        <w:t xml:space="preserve">Creating </w:t>
-      </w:r>
-      <w:r>
-        <w:t>customers</w:t>
-      </w:r>
-      <w:r>
-        <w:t>.</w:t>
+        <w:t>Creating customers.</w:t>
       </w:r>
     </w:p>
     <w:p>
@@ -969,13 +1115,7 @@
         </w:numPr>
       </w:pPr>
       <w:r>
-        <w:t xml:space="preserve">Creating vehicles associated with </w:t>
-      </w:r>
-      <w:r>
-        <w:t>customers</w:t>
-      </w:r>
-      <w:r>
-        <w:t>.</w:t>
+        <w:t>Creating vehicles associated with customers.</w:t>
       </w:r>
     </w:p>
     <w:p>
@@ -987,13 +1127,7 @@
         </w:numPr>
       </w:pPr>
       <w:r>
-        <w:t xml:space="preserve">Generating appointments for </w:t>
-      </w:r>
-      <w:r>
-        <w:t>customers</w:t>
-      </w:r>
-      <w:r>
-        <w:t xml:space="preserve"> with their vehicles</w:t>
+        <w:t>Generating appointments for customers with their vehicles</w:t>
       </w:r>
     </w:p>
     <w:p>
@@ -1017,16 +1151,7 @@
         </w:numPr>
       </w:pPr>
       <w:r>
-        <w:t>Retriev</w:t>
-      </w:r>
-      <w:r>
-        <w:t>ing</w:t>
-      </w:r>
-      <w:r>
-        <w:t xml:space="preserve"> appointments</w:t>
-      </w:r>
-      <w:r>
-        <w:t xml:space="preserve"> by date</w:t>
+        <w:t>Retrieving appointments by date</w:t>
       </w:r>
     </w:p>
     <w:p>
@@ -1063,11 +1188,9 @@
       <w:pPr>
         <w:pStyle w:val="Heading2"/>
       </w:pPr>
-      <w:bookmarkStart w:id="2" w:name="_Toc190255137"/>
-      <w:r>
-        <w:t>Objectives</w:t>
-      </w:r>
-      <w:bookmarkEnd w:id="2"/>
+      <w:r>
+        <w:t>Goals</w:t>
+      </w:r>
     </w:p>
     <w:p>
       <w:pPr>
@@ -1115,69 +1238,57 @@
       <w:pPr>
         <w:pStyle w:val="Heading2"/>
       </w:pPr>
-      <w:bookmarkStart w:id="3" w:name="_Toc190255138"/>
+      <w:bookmarkStart w:id="2" w:name="_Toc190256828"/>
       <w:r>
         <w:t>Tasks</w:t>
       </w:r>
+      <w:bookmarkEnd w:id="2"/>
+    </w:p>
+    <w:p>
+      <w:pPr>
+        <w:pStyle w:val="Heading3"/>
+        <w:rPr>
+          <w:lang w:val="en-US"/>
+        </w:rPr>
+      </w:pPr>
+      <w:bookmarkStart w:id="3" w:name="_Toc190256829"/>
+      <w:r>
+        <w:rPr>
+          <w:lang w:val="en-US"/>
+        </w:rPr>
+        <w:t>Creat</w:t>
+      </w:r>
+      <w:r>
+        <w:rPr>
+          <w:lang w:val="en-US"/>
+        </w:rPr>
+        <w:t>ing</w:t>
+      </w:r>
+      <w:r>
+        <w:rPr>
+          <w:lang w:val="en-US"/>
+        </w:rPr>
+        <w:t xml:space="preserve"> </w:t>
+      </w:r>
+      <w:r>
+        <w:rPr>
+          <w:lang w:val="en-US"/>
+        </w:rPr>
+        <w:t>customers</w:t>
+      </w:r>
       <w:bookmarkEnd w:id="3"/>
     </w:p>
     <w:p>
       <w:pPr>
-        <w:pStyle w:val="Heading3"/>
-        <w:rPr>
-          <w:lang w:val="en-US"/>
-        </w:rPr>
-      </w:pPr>
-      <w:bookmarkStart w:id="4" w:name="_Toc190255139"/>
-      <w:r>
-        <w:rPr>
-          <w:lang w:val="en-US"/>
-        </w:rPr>
-        <w:t>Creat</w:t>
-      </w:r>
-      <w:r>
-        <w:rPr>
-          <w:lang w:val="en-US"/>
-        </w:rPr>
-        <w:t>ing</w:t>
-      </w:r>
-      <w:r>
-        <w:rPr>
-          <w:lang w:val="en-US"/>
-        </w:rPr>
-        <w:t xml:space="preserve"> </w:t>
-      </w:r>
-      <w:r>
-        <w:rPr>
-          <w:lang w:val="en-US"/>
-        </w:rPr>
-        <w:t>customers</w:t>
-      </w:r>
-      <w:bookmarkEnd w:id="4"/>
-    </w:p>
-    <w:p>
-      <w:pPr>
-        <w:rPr>
-          <w:lang w:val="en-US"/>
-        </w:rPr>
-      </w:pPr>
-      <w:r>
-        <w:rPr>
-          <w:lang w:val="en-US"/>
-        </w:rPr>
-        <w:t xml:space="preserve">The </w:t>
-      </w:r>
-      <w:r>
-        <w:rPr>
-          <w:lang w:val="en-US"/>
-        </w:rPr>
-        <w:t>API</w:t>
-      </w:r>
-      <w:r>
-        <w:rPr>
-          <w:lang w:val="en-US"/>
-        </w:rPr>
-        <w:t xml:space="preserve"> must allow to register a new customer by providing their personal data.</w:t>
+        <w:rPr>
+          <w:lang w:val="en-US"/>
+        </w:rPr>
+      </w:pPr>
+      <w:r>
+        <w:rPr>
+          <w:lang w:val="en-US"/>
+        </w:rPr>
+        <w:t>The API must allow to register a new customer by providing their personal data.</w:t>
       </w:r>
     </w:p>
     <w:p>
@@ -1331,15 +1442,13 @@
         </w:rPr>
         <w:t xml:space="preserve">a customer needs to be contacted regarding their appointment </w:t>
       </w:r>
-      <w:proofErr w:type="gramStart"/>
       <w:r>
         <w:rPr>
           <w:highlight w:val="yellow"/>
           <w:lang w:val="en-US"/>
         </w:rPr>
-        <w:t>and also</w:t>
-      </w:r>
-      <w:proofErr w:type="gramEnd"/>
+        <w:t>and</w:t>
+      </w:r>
       <w:r>
         <w:rPr>
           <w:highlight w:val="yellow"/>
@@ -1499,13 +1608,7 @@
         <w:rPr>
           <w:lang w:val="en-US"/>
         </w:rPr>
-        <w:t xml:space="preserve"> must be </w:t>
-      </w:r>
-      <w:r>
-        <w:rPr>
-          <w:lang w:val="en-US"/>
-        </w:rPr>
-        <w:t xml:space="preserve">UTC offset in time between UTC time and </w:t>
+        <w:t xml:space="preserve"> must be UTC offset in time between UTC time and </w:t>
       </w:r>
       <w:r>
         <w:rPr>
@@ -1530,11 +1633,11 @@
       <w:pPr>
         <w:pStyle w:val="Heading3"/>
       </w:pPr>
-      <w:bookmarkStart w:id="5" w:name="_Toc190255140"/>
+      <w:bookmarkStart w:id="4" w:name="_Toc190256830"/>
       <w:r>
         <w:t>Creating vehicles associated with customers.</w:t>
       </w:r>
-      <w:bookmarkEnd w:id="5"/>
+      <w:bookmarkEnd w:id="4"/>
     </w:p>
     <w:p>
       <w:r>
@@ -1806,13 +1909,7 @@
         <w:rPr>
           <w:lang w:val="en-US"/>
         </w:rPr>
-        <w:t>c</w:t>
-      </w:r>
-      <w:r>
-        <w:rPr>
-          <w:lang w:val="en-US"/>
-        </w:rPr>
-        <w:t>ustomer</w:t>
+        <w:t>customer</w:t>
       </w:r>
     </w:p>
     <w:p>
@@ -1822,27 +1919,18 @@
           <w:lang w:val="en-US"/>
         </w:rPr>
       </w:pPr>
-      <w:bookmarkStart w:id="6" w:name="_Toc190255141"/>
+      <w:bookmarkStart w:id="5" w:name="_Toc190256831"/>
       <w:r>
         <w:rPr>
           <w:lang w:val="en-US"/>
         </w:rPr>
         <w:t>Create an Appointment</w:t>
       </w:r>
-      <w:bookmarkEnd w:id="6"/>
-    </w:p>
-    <w:p>
-      <w:r>
-        <w:t xml:space="preserve">A customer can schedule an appointment by providing </w:t>
-      </w:r>
-      <w:r>
-        <w:t xml:space="preserve">followung </w:t>
-      </w:r>
-      <w:r>
-        <w:t>details</w:t>
-      </w:r>
-      <w:r>
-        <w:t>.</w:t>
+      <w:bookmarkEnd w:id="5"/>
+    </w:p>
+    <w:p>
+      <w:r>
+        <w:t>A customer can schedule an appointment by providing followung details.</w:t>
       </w:r>
     </w:p>
     <w:p>
@@ -1869,7 +1957,6 @@
         </w:rPr>
         <w:t>fields</w:t>
       </w:r>
-      <w:proofErr w:type="spellStart"/>
     </w:p>
     <w:p>
       <w:pPr>
@@ -1900,7 +1987,6 @@
           <w:lang w:val="es-ES_tradnl"/>
         </w:rPr>
       </w:pPr>
-      <w:proofErr w:type="spellEnd"/>
       <w:r>
         <w:rPr>
           <w:lang w:val="es-ES_tradnl"/>
@@ -2224,16 +2310,34 @@
     </w:p>
     <w:p>
       <w:pPr>
+        <w:pStyle w:val="ListParagraph"/>
+        <w:numPr>
+          <w:ilvl w:val="0"/>
+          <w:numId w:val="7"/>
+        </w:numPr>
+        <w:rPr>
+          <w:lang w:val="en-US"/>
+        </w:rPr>
+      </w:pPr>
+      <w:r>
+        <w:rPr>
+          <w:lang w:val="en-US"/>
+        </w:rPr>
+        <w:t>Customer must have at least one vehicle associated</w:t>
+      </w:r>
+    </w:p>
+    <w:p>
+      <w:pPr>
         <w:pStyle w:val="Heading3"/>
         <w:rPr>
           <w:lang w:val="en-US"/>
         </w:rPr>
       </w:pPr>
-      <w:bookmarkStart w:id="7" w:name="_Toc190255142"/>
+      <w:bookmarkStart w:id="6" w:name="_Toc190256832"/>
       <w:r>
         <w:t>Update an appointment</w:t>
       </w:r>
-      <w:bookmarkEnd w:id="7"/>
+      <w:bookmarkEnd w:id="6"/>
     </w:p>
     <w:p>
       <w:pPr>
@@ -2365,14 +2469,14 @@
           <w:lang w:val="en-US"/>
         </w:rPr>
       </w:pPr>
-      <w:bookmarkStart w:id="8" w:name="_Toc190255143"/>
+      <w:bookmarkStart w:id="7" w:name="_Toc190256833"/>
       <w:r>
         <w:rPr>
           <w:lang w:val="en-US"/>
         </w:rPr>
         <w:t>Retrieve appointments</w:t>
       </w:r>
-      <w:bookmarkEnd w:id="8"/>
+      <w:bookmarkEnd w:id="7"/>
     </w:p>
     <w:p>
       <w:pPr>
@@ -2460,14 +2564,11 @@
       <w:pPr>
         <w:pStyle w:val="Heading3"/>
       </w:pPr>
-      <w:bookmarkStart w:id="9" w:name="_Toc190255144"/>
-      <w:r>
-        <w:t>Cancelling</w:t>
-      </w:r>
-      <w:r>
-        <w:t xml:space="preserve"> an appointment</w:t>
-      </w:r>
-      <w:bookmarkEnd w:id="9"/>
+      <w:bookmarkStart w:id="8" w:name="_Toc190256834"/>
+      <w:r>
+        <w:t>Cancelling an appointment</w:t>
+      </w:r>
+      <w:bookmarkEnd w:id="8"/>
     </w:p>
     <w:p>
       <w:pPr>
@@ -2573,19 +2674,222 @@
         <w:rPr>
           <w:lang w:val="en-US"/>
         </w:rPr>
-        <w:t>Appointment</w:t>
-      </w:r>
-      <w:r>
-        <w:rPr>
-          <w:lang w:val="en-US"/>
-        </w:rPr>
-        <w:t xml:space="preserve"> must exist</w:t>
-      </w:r>
-    </w:p>
-    <w:p>
-      <w:pPr>
-        <w:rPr>
-          <w:lang w:val="es-ES_tradnl"/>
+        <w:t>Appointment must exist</w:t>
+      </w:r>
+    </w:p>
+    <w:p>
+      <w:pPr>
+        <w:rPr>
+          <w:lang w:val="es-ES_tradnl"/>
+        </w:rPr>
+      </w:pPr>
+    </w:p>
+    <w:p>
+      <w:pPr>
+        <w:rPr>
+          <w:lang w:val="es-ES_tradnl"/>
+        </w:rPr>
+      </w:pPr>
+    </w:p>
+    <w:p>
+      <w:pPr>
+        <w:rPr>
+          <w:lang w:val="es-ES_tradnl"/>
+        </w:rPr>
+      </w:pPr>
+    </w:p>
+    <w:p>
+      <w:pPr>
+        <w:rPr>
+          <w:lang w:val="es-ES_tradnl"/>
+        </w:rPr>
+      </w:pPr>
+    </w:p>
+    <w:p>
+      <w:pPr>
+        <w:pStyle w:val="Heading1"/>
+        <w:rPr>
+          <w:lang w:val="en-US"/>
+        </w:rPr>
+      </w:pPr>
+      <w:bookmarkStart w:id="9" w:name="_Toc190256835"/>
+      <w:r>
+        <w:rPr>
+          <w:lang w:val="en-US"/>
+        </w:rPr>
+        <w:lastRenderedPageBreak/>
+        <w:t>Technical Stack</w:t>
+      </w:r>
+      <w:bookmarkEnd w:id="9"/>
+    </w:p>
+    <w:p>
+      <w:pPr>
+        <w:rPr>
+          <w:lang w:val="en-US"/>
+        </w:rPr>
+      </w:pPr>
+      <w:r>
+        <w:rPr>
+          <w:lang w:val="en-US"/>
+        </w:rPr>
+        <w:t>The API will be built using</w:t>
+      </w:r>
+      <w:r>
+        <w:rPr>
+          <w:lang w:val="en-US"/>
+        </w:rPr>
+        <w:t xml:space="preserve"> AWS Cloud architecture with API Gateway, Lambda (Node) </w:t>
+      </w:r>
+      <w:r>
+        <w:rPr>
+          <w:lang w:val="en-US"/>
+        </w:rPr>
+        <w:t xml:space="preserve">and </w:t>
+      </w:r>
+      <w:r>
+        <w:rPr>
+          <w:lang w:val="en-US"/>
+        </w:rPr>
+        <w:t xml:space="preserve">PostgreSQL and </w:t>
+      </w:r>
+      <w:r>
+        <w:rPr>
+          <w:lang w:val="en-US"/>
+        </w:rPr>
+        <w:t>will follow RESTful principles. It will include endpoints for managing clients, vehicles, and appointments, along with proper validation, error handling, and documentation.</w:t>
+      </w:r>
+    </w:p>
+    <w:p>
+      <w:pPr>
+        <w:rPr>
+          <w:lang w:val="en-US"/>
+        </w:rPr>
+      </w:pPr>
+      <w:r>
+        <w:rPr>
+          <w:lang w:val="en-US"/>
+        </w:rPr>
+        <w:t>The architecture consists of the following key components:</w:t>
+      </w:r>
+    </w:p>
+    <w:p>
+      <w:pPr>
+        <w:pStyle w:val="ListParagraph"/>
+        <w:numPr>
+          <w:ilvl w:val="0"/>
+          <w:numId w:val="14"/>
+        </w:numPr>
+        <w:rPr>
+          <w:lang w:val="en-US"/>
+        </w:rPr>
+      </w:pPr>
+      <w:r>
+        <w:rPr>
+          <w:lang w:val="en-US"/>
+        </w:rPr>
+        <w:t>API Gateway: Acts as the entry point for all client requests.</w:t>
+      </w:r>
+    </w:p>
+    <w:p>
+      <w:pPr>
+        <w:pStyle w:val="ListParagraph"/>
+        <w:numPr>
+          <w:ilvl w:val="0"/>
+          <w:numId w:val="14"/>
+        </w:numPr>
+        <w:rPr>
+          <w:lang w:val="en-US"/>
+        </w:rPr>
+      </w:pPr>
+      <w:r>
+        <w:rPr>
+          <w:lang w:val="en-US"/>
+        </w:rPr>
+        <w:t>AWS Lambda: Handles the business logic for CRUD operations.</w:t>
+      </w:r>
+    </w:p>
+    <w:p>
+      <w:pPr>
+        <w:pStyle w:val="ListParagraph"/>
+        <w:numPr>
+          <w:ilvl w:val="0"/>
+          <w:numId w:val="14"/>
+        </w:numPr>
+        <w:rPr>
+          <w:lang w:val="en-US"/>
+        </w:rPr>
+      </w:pPr>
+      <w:r>
+        <w:rPr>
+          <w:lang w:val="en-US"/>
+        </w:rPr>
+        <w:t>Amazon RDS (PostgreSQL): Stores and manages the data.</w:t>
+      </w:r>
+    </w:p>
+    <w:p>
+      <w:pPr>
+        <w:pStyle w:val="ListParagraph"/>
+        <w:numPr>
+          <w:ilvl w:val="0"/>
+          <w:numId w:val="14"/>
+        </w:numPr>
+        <w:rPr>
+          <w:lang w:val="en-US"/>
+        </w:rPr>
+      </w:pPr>
+      <w:r>
+        <w:rPr>
+          <w:lang w:val="en-US"/>
+        </w:rPr>
+        <w:t>Amazon CloudWatch: Monitors and logs API and Lambda performance.</w:t>
+      </w:r>
+    </w:p>
+    <w:p>
+      <w:pPr>
+        <w:pStyle w:val="ListParagraph"/>
+        <w:numPr>
+          <w:ilvl w:val="0"/>
+          <w:numId w:val="14"/>
+        </w:numPr>
+        <w:rPr>
+          <w:lang w:val="en-US"/>
+        </w:rPr>
+      </w:pPr>
+      <w:r>
+        <w:rPr>
+          <w:lang w:val="en-US"/>
+        </w:rPr>
+        <w:t xml:space="preserve">Serverless Framework to </w:t>
+      </w:r>
+      <w:r>
+        <w:rPr>
+          <w:lang w:val="en-US"/>
+        </w:rPr>
+        <w:t>automate AWS resource provisioning.</w:t>
+      </w:r>
+    </w:p>
+    <w:p>
+      <w:pPr>
+        <w:pStyle w:val="ListParagraph"/>
+        <w:numPr>
+          <w:ilvl w:val="0"/>
+          <w:numId w:val="14"/>
+        </w:numPr>
+        <w:rPr>
+          <w:lang w:val="en-US"/>
+        </w:rPr>
+      </w:pPr>
+      <w:r>
+        <w:rPr>
+          <w:lang w:val="en-US"/>
+        </w:rPr>
+        <w:t>Postman Collections to automate API testing</w:t>
+      </w:r>
+    </w:p>
+    <w:p>
+      <w:pPr>
+        <w:rPr>
+          <w:lang w:val="en-US"/>
         </w:rPr>
       </w:pPr>
     </w:p>
@@ -4053,7 +4357,7 @@
   <w:abstractNum w:abstractNumId="11" w15:restartNumberingAfterBreak="0">
     <w:nsid w:val="67A44014"/>
     <w:multiLevelType w:val="hybridMultilevel"/>
-    <w:tmpl w:val="1FF09E78"/>
+    <w:tmpl w:val="03320B28"/>
     <w:lvl w:ilvl="0" w:tplc="04090001">
       <w:start w:val="1"/>
       <w:numFmt w:val="bullet"/>

</xml_diff>